<commit_message>
Aplica numeros de aluno reais (Nuno=1900405, Flavio=1900860) e corrige nome do colega
- Substitui [N. A PREENCHER] -> 1900405 (Nuno Rolo) em todo o codigo e relatorios
- Substitui [N. A PREENCHER] -> 1900860 (Flavio Oliveira) em todo o codigo
- Corrige 'Fabio Oliveira' (lapso no plano e no relatorio do Nuno) -> 'Flavio Oliveira'
- Remove mencao a symbol_table.py no relatorio efolioB_quadcore.docx (modulo nao existe)
- Atualiza README.txt com o numero de aluno do Flavio
</commit_message>
<xml_diff>
--- a/relatorio efolioB_quadcore.docx
+++ b/relatorio efolioB_quadcore.docx
@@ -201,7 +201,7 @@
         <w:rPr>
           <w:rStyle w:val="Forte"/>
         </w:rPr>
-        <w:t>Fábio Oliveira (19</w:t>
+        <w:t>Flávio Oliveira (19</w:t>
       </w:r>
       <w:r>
         <w:rPr>
@@ -807,13 +807,6 @@
           <w:lang w:val="en-GB"/>
         </w:rPr>
         <w:br/>
-      </w:r>
-      <w:r>
-        <w:rPr>
-          <w:rStyle w:val="VerbatimChar"/>
-          <w:lang w:val="en-GB"/>
-        </w:rPr>
-        <w:t>symbol_table.py</w:t>
       </w:r>
       <w:r>
         <w:rPr>

</xml_diff>

<commit_message>
feat: critério para zero-init documentado no relatório final
</commit_message>
<xml_diff>
--- a/relatorio efolioB_quadcore.docx
+++ b/relatorio efolioB_quadcore.docx
@@ -177,25 +177,7 @@
         <w:rPr>
           <w:rStyle w:val="Strong"/>
         </w:rPr>
-        <w:t>Fábio</w:t>
-      </w:r>
-      <w:r>
-        <w:rPr>
-          <w:rStyle w:val="Strong"/>
-        </w:rPr>
-        <w:t xml:space="preserve"> Oliveira (</w:t>
-      </w:r>
-      <w:r>
-        <w:rPr>
-          <w:rStyle w:val="Strong"/>
-        </w:rPr>
-        <w:t>1800960</w:t>
-      </w:r>
-      <w:r>
-        <w:rPr>
-          <w:rStyle w:val="Strong"/>
-        </w:rPr>
-        <w:t>)</w:t>
+        <w:t>Fábio Oliveira (1800960)</w:t>
       </w:r>
     </w:p>
     <w:p>
@@ -629,8 +611,8 @@
           <w:color w:themeColor="text2" w:themeTint="99" w:val="548DD4"/>
         </w:rPr>
       </w:pPr>
-      <w:bookmarkStart w:id="1" w:name="introdução"/>
-      <w:bookmarkStart w:id="2" w:name="arquitetura-geral-do-compilador"/>
+      <w:bookmarkStart w:id="1" w:name="arquitetura-geral-do-compilador"/>
+      <w:bookmarkStart w:id="2" w:name="introdução_Copy_1"/>
       <w:bookmarkEnd w:id="1"/>
       <w:bookmarkEnd w:id="2"/>
       <w:r>
@@ -659,7 +641,7 @@
         <w:pStyle w:val="Compact"/>
         <w:numPr>
           <w:ilvl w:val="0"/>
-          <w:numId w:val="7"/>
+          <w:numId w:val="8"/>
         </w:numPr>
         <w:rPr/>
       </w:pPr>
@@ -673,7 +655,7 @@
         <w:pStyle w:val="Compact"/>
         <w:numPr>
           <w:ilvl w:val="0"/>
-          <w:numId w:val="6"/>
+          <w:numId w:val="9"/>
         </w:numPr>
         <w:rPr/>
       </w:pPr>
@@ -687,7 +669,7 @@
         <w:pStyle w:val="Compact"/>
         <w:numPr>
           <w:ilvl w:val="0"/>
-          <w:numId w:val="6"/>
+          <w:numId w:val="10"/>
         </w:numPr>
         <w:rPr/>
       </w:pPr>
@@ -701,7 +683,7 @@
         <w:pStyle w:val="Compact"/>
         <w:numPr>
           <w:ilvl w:val="0"/>
-          <w:numId w:val="6"/>
+          <w:numId w:val="11"/>
         </w:numPr>
         <w:rPr/>
       </w:pPr>
@@ -715,7 +697,7 @@
         <w:pStyle w:val="Compact"/>
         <w:numPr>
           <w:ilvl w:val="0"/>
-          <w:numId w:val="6"/>
+          <w:numId w:val="12"/>
         </w:numPr>
         <w:rPr/>
       </w:pPr>
@@ -729,7 +711,7 @@
         <w:pStyle w:val="Compact"/>
         <w:numPr>
           <w:ilvl w:val="0"/>
-          <w:numId w:val="6"/>
+          <w:numId w:val="13"/>
         </w:numPr>
         <w:rPr/>
       </w:pPr>
@@ -743,7 +725,7 @@
         <w:pStyle w:val="Compact"/>
         <w:numPr>
           <w:ilvl w:val="0"/>
-          <w:numId w:val="6"/>
+          <w:numId w:val="14"/>
         </w:numPr>
         <w:rPr/>
       </w:pPr>
@@ -956,8 +938,8 @@
           <w:color w:themeColor="text2" w:themeTint="99" w:val="548DD4"/>
         </w:rPr>
       </w:pPr>
-      <w:bookmarkStart w:id="3" w:name="arquitetura-geral-do-compilador"/>
-      <w:bookmarkStart w:id="4" w:name="análise-léxica-e-sintática"/>
+      <w:bookmarkStart w:id="3" w:name="análise-léxica-e-sintática"/>
+      <w:bookmarkStart w:id="4" w:name="arquitetura-geral-do-compilador_Copy_1"/>
       <w:bookmarkEnd w:id="3"/>
       <w:bookmarkEnd w:id="4"/>
       <w:r>
@@ -1317,8 +1299,8 @@
           <w:color w:themeColor="text2" w:themeTint="99" w:val="548DD4"/>
         </w:rPr>
       </w:pPr>
-      <w:bookmarkStart w:id="5" w:name="análise-léxica-e-sintática"/>
-      <w:bookmarkStart w:id="6" w:name="construção-da-ast"/>
+      <w:bookmarkStart w:id="5" w:name="construção-da-ast"/>
+      <w:bookmarkStart w:id="6" w:name="análise-léxica-e-sintática_Copy_1"/>
       <w:bookmarkEnd w:id="5"/>
       <w:bookmarkEnd w:id="6"/>
       <w:r>
@@ -1752,8 +1734,8 @@
           <w:color w:themeColor="text2" w:themeTint="99" w:val="548DD4"/>
         </w:rPr>
       </w:pPr>
-      <w:bookmarkStart w:id="7" w:name="construção-da-ast"/>
-      <w:bookmarkStart w:id="8" w:name="análise-semântica"/>
+      <w:bookmarkStart w:id="7" w:name="análise-semântica"/>
+      <w:bookmarkStart w:id="8" w:name="construção-da-ast_Copy_1"/>
       <w:bookmarkEnd w:id="7"/>
       <w:bookmarkEnd w:id="8"/>
       <w:r>
@@ -1998,8 +1980,8 @@
           <w:color w:themeColor="text2" w:themeTint="99" w:val="548DD4"/>
         </w:rPr>
       </w:pPr>
-      <w:bookmarkStart w:id="9" w:name="análise-semântica"/>
-      <w:bookmarkStart w:id="10" w:name="geração-de-código-intermédio-tac"/>
+      <w:bookmarkStart w:id="9" w:name="geração-de-código-intermédio-tac"/>
+      <w:bookmarkStart w:id="10" w:name="análise-semântica_Copy_1"/>
       <w:bookmarkEnd w:id="9"/>
       <w:bookmarkEnd w:id="10"/>
       <w:r>
@@ -2423,11 +2405,42 @@
     </w:p>
     <w:p>
       <w:pPr>
+        <w:pStyle w:val="Heading2"/>
+        <w:rPr>
+          <w:lang w:val="pt-PT"/>
+        </w:rPr>
+      </w:pPr>
+      <w:r>
+        <w:rPr>
+          <w:lang w:val="pt-PT"/>
+        </w:rPr>
+        <w:t>6</w:t>
+      </w:r>
+      <w:r>
+        <w:rPr>
+          <w:lang w:val="pt-PT"/>
+        </w:rPr>
+        <w:t xml:space="preserve">.1 </w:t>
+      </w:r>
+      <w:r>
+        <w:rPr>
+          <w:lang w:val="pt-PT"/>
+        </w:rPr>
+        <w:t>Inicialização a zero</w:t>
+      </w:r>
+    </w:p>
+    <w:p>
+      <w:pPr>
         <w:pStyle w:val="Normal"/>
-        <w:rPr/>
-      </w:pPr>
-      <w:r>
-        <w:rPr/>
+        <w:rPr>
+          <w:lang w:val="pt-PT"/>
+        </w:rPr>
+      </w:pPr>
+      <w:r>
+        <w:rPr>
+          <w:lang w:val="pt-PT"/>
+        </w:rPr>
+        <w:t>A regra de inicialização por defeito a zero, definida na especificação da MOCP “Sem inicialização (valor por omissão = 0)”, foi aplicada tanto a escalares como a vetores. Nos escalares, esta garantia fica explícita no TAC. Nos vetores, optou-se por não a materializar instrução a instrução, uma vez que isso obrigaria a emitir n atribuições a zero (uma por elemento) poluindo o TAC. Em alternativa, inclui-se no TAC um comentário que documenta essa premissa, ficando a inicialização efetiva a cargo da fase de geração de código final.</w:t>
       </w:r>
     </w:p>
     <w:p>
@@ -2437,8 +2450,8 @@
           <w:color w:themeColor="text2" w:themeTint="99" w:val="548DD4"/>
         </w:rPr>
       </w:pPr>
-      <w:bookmarkStart w:id="11" w:name="geração-de-código-intermédio-tac"/>
-      <w:bookmarkStart w:id="12" w:name="otimização-de-código-intermédio"/>
+      <w:bookmarkStart w:id="11" w:name="otimização-de-código-intermédio"/>
+      <w:bookmarkStart w:id="12" w:name="geração-de-código-intermédio-tac_Copy_1"/>
       <w:bookmarkEnd w:id="11"/>
       <w:bookmarkEnd w:id="12"/>
       <w:r>
@@ -2595,8 +2608,8 @@
         <w:pStyle w:val="Heading2"/>
         <w:rPr/>
       </w:pPr>
-      <w:bookmarkStart w:id="14" w:name="constant-folding"/>
-      <w:bookmarkStart w:id="15" w:name="simplificação-algébrica"/>
+      <w:bookmarkStart w:id="14" w:name="simplificação-algébrica"/>
+      <w:bookmarkStart w:id="15" w:name="constant-folding_Copy_1"/>
       <w:bookmarkEnd w:id="14"/>
       <w:bookmarkEnd w:id="15"/>
       <w:r>
@@ -2708,8 +2721,8 @@
         <w:pStyle w:val="Heading2"/>
         <w:rPr/>
       </w:pPr>
-      <w:bookmarkStart w:id="16" w:name="simplificação-algébrica"/>
-      <w:bookmarkStart w:id="17" w:name="constant-propagation"/>
+      <w:bookmarkStart w:id="16" w:name="constant-propagation"/>
+      <w:bookmarkStart w:id="17" w:name="simplificação-algébrica_Copy_1"/>
       <w:bookmarkEnd w:id="16"/>
       <w:bookmarkEnd w:id="17"/>
       <w:r>
@@ -2807,8 +2820,8 @@
         <w:pStyle w:val="Heading2"/>
         <w:rPr/>
       </w:pPr>
-      <w:bookmarkStart w:id="18" w:name="constant-propagation"/>
-      <w:bookmarkStart w:id="19" w:name="copy-propagation"/>
+      <w:bookmarkStart w:id="18" w:name="copy-propagation"/>
+      <w:bookmarkStart w:id="19" w:name="constant-propagation_Copy_1"/>
       <w:bookmarkEnd w:id="18"/>
       <w:bookmarkEnd w:id="19"/>
       <w:r>
@@ -2858,8 +2871,8 @@
         <w:pStyle w:val="Heading2"/>
         <w:rPr/>
       </w:pPr>
-      <w:bookmarkStart w:id="20" w:name="copy-propagation"/>
-      <w:bookmarkStart w:id="21" w:name="dead-code-elimination"/>
+      <w:bookmarkStart w:id="20" w:name="dead-code-elimination"/>
+      <w:bookmarkStart w:id="21" w:name="copy-propagation_Copy_1"/>
       <w:bookmarkEnd w:id="20"/>
       <w:bookmarkEnd w:id="21"/>
       <w:r>
@@ -3037,9 +3050,9 @@
           <w:color w:themeColor="text2" w:themeTint="99" w:val="548DD4"/>
         </w:rPr>
       </w:pPr>
-      <w:bookmarkStart w:id="22" w:name="otimização-de-código-intermédio"/>
-      <w:bookmarkStart w:id="23" w:name="dead-code-elimination"/>
-      <w:bookmarkStart w:id="24" w:name="demonstração-da-otimização"/>
+      <w:bookmarkStart w:id="22" w:name="demonstração-da-otimização"/>
+      <w:bookmarkStart w:id="23" w:name="dead-code-elimination_Copy_1"/>
+      <w:bookmarkStart w:id="24" w:name="otimização-de-código-intermédio_Copy_1"/>
       <w:bookmarkEnd w:id="22"/>
       <w:bookmarkEnd w:id="23"/>
       <w:bookmarkEnd w:id="24"/>
@@ -3206,8 +3219,8 @@
           <w:lang w:val="en-GB"/>
         </w:rPr>
       </w:pPr>
-      <w:bookmarkStart w:id="26" w:name="tac-original"/>
-      <w:bookmarkStart w:id="27" w:name="tac-otimizado"/>
+      <w:bookmarkStart w:id="26" w:name="tac-otimizado"/>
+      <w:bookmarkStart w:id="27" w:name="tac-original_Copy_1"/>
       <w:bookmarkEnd w:id="26"/>
       <w:bookmarkEnd w:id="27"/>
       <w:r>
@@ -3367,9 +3380,9 @@
           <w:color w:themeColor="text2" w:themeTint="99" w:val="548DD4"/>
         </w:rPr>
       </w:pPr>
-      <w:bookmarkStart w:id="28" w:name="demonstração-da-otimização"/>
-      <w:bookmarkStart w:id="29" w:name="tac-otimizado"/>
-      <w:bookmarkStart w:id="30" w:name="sistema-de-testes"/>
+      <w:bookmarkStart w:id="28" w:name="sistema-de-testes"/>
+      <w:bookmarkStart w:id="29" w:name="tac-otimizado_Copy_1"/>
+      <w:bookmarkStart w:id="30" w:name="demonstração-da-otimização_Copy_1"/>
       <w:bookmarkEnd w:id="28"/>
       <w:bookmarkEnd w:id="29"/>
       <w:bookmarkEnd w:id="30"/>
@@ -3662,8 +3675,8 @@
           <w:color w:themeColor="text2" w:themeTint="99" w:val="548DD4"/>
         </w:rPr>
       </w:pPr>
-      <w:bookmarkStart w:id="31" w:name="sistema-de-testes"/>
-      <w:bookmarkStart w:id="32" w:name="dificuldades-encontradas"/>
+      <w:bookmarkStart w:id="31" w:name="dificuldades-encontradas"/>
+      <w:bookmarkStart w:id="32" w:name="sistema-de-testes_Copy_1"/>
       <w:bookmarkEnd w:id="31"/>
       <w:bookmarkEnd w:id="32"/>
       <w:r>
@@ -3819,8 +3832,8 @@
           <w:color w:themeColor="text2" w:themeTint="99" w:val="548DD4"/>
         </w:rPr>
       </w:pPr>
-      <w:bookmarkStart w:id="33" w:name="dificuldades-encontradas"/>
-      <w:bookmarkStart w:id="34" w:name="conclusão"/>
+      <w:bookmarkStart w:id="33" w:name="conclusão"/>
+      <w:bookmarkStart w:id="34" w:name="dificuldades-encontradas_Copy_1"/>
       <w:bookmarkEnd w:id="33"/>
       <w:bookmarkEnd w:id="34"/>
       <w:r>
@@ -4108,8 +4121,7 @@
           <w:color w:themeColor="text2" w:themeTint="99" w:val="548DD4"/>
         </w:rPr>
       </w:pPr>
-      <w:bookmarkStart w:id="35" w:name="conclusão"/>
-      <w:bookmarkStart w:id="36" w:name="bibliografia"/>
+      <w:bookmarkStart w:id="35" w:name="conclusão_Copy_1"/>
       <w:bookmarkEnd w:id="35"/>
       <w:r>
         <w:rPr>
@@ -4198,12 +4210,12 @@
         <w:spacing w:lineRule="auto" w:line="240" w:before="0" w:after="200"/>
         <w:rPr/>
       </w:pPr>
-      <w:bookmarkStart w:id="37" w:name="bibliografia"/>
+      <w:bookmarkStart w:id="36" w:name="bibliografia"/>
       <w:r>
         <w:rPr/>
         <w:t>Material pedagógico da UC 21018 - Compilação, Universidade Aberta.</w:t>
       </w:r>
-      <w:bookmarkEnd w:id="37"/>
+      <w:bookmarkEnd w:id="36"/>
     </w:p>
     <w:p>
       <w:pPr>
@@ -5243,6 +5255,125 @@
       <w:rPr/>
     </w:lvl>
   </w:abstractNum>
+  <w:abstractNum w:abstractNumId="7">
+    <w:lvl w:ilvl="0">
+      <w:start w:val="1"/>
+      <w:numFmt w:val="decimal"/>
+      <w:lvlText w:val="%1."/>
+      <w:lvlJc w:val="left"/>
+      <w:pPr>
+        <w:tabs>
+          <w:tab w:val="num" w:pos="0"/>
+        </w:tabs>
+        <w:ind w:left="720" w:hanging="360"/>
+      </w:pPr>
+      <w:rPr/>
+    </w:lvl>
+    <w:lvl w:ilvl="1">
+      <w:start w:val="1"/>
+      <w:numFmt w:val="decimal"/>
+      <w:lvlText w:val="%2."/>
+      <w:lvlJc w:val="left"/>
+      <w:pPr>
+        <w:tabs>
+          <w:tab w:val="num" w:pos="0"/>
+        </w:tabs>
+        <w:ind w:left="1440" w:hanging="360"/>
+      </w:pPr>
+      <w:rPr/>
+    </w:lvl>
+    <w:lvl w:ilvl="2">
+      <w:start w:val="1"/>
+      <w:numFmt w:val="decimal"/>
+      <w:lvlText w:val="%3."/>
+      <w:lvlJc w:val="left"/>
+      <w:pPr>
+        <w:tabs>
+          <w:tab w:val="num" w:pos="0"/>
+        </w:tabs>
+        <w:ind w:left="2160" w:hanging="360"/>
+      </w:pPr>
+      <w:rPr/>
+    </w:lvl>
+    <w:lvl w:ilvl="3">
+      <w:start w:val="1"/>
+      <w:numFmt w:val="decimal"/>
+      <w:lvlText w:val="%4."/>
+      <w:lvlJc w:val="left"/>
+      <w:pPr>
+        <w:tabs>
+          <w:tab w:val="num" w:pos="0"/>
+        </w:tabs>
+        <w:ind w:left="2880" w:hanging="360"/>
+      </w:pPr>
+      <w:rPr/>
+    </w:lvl>
+    <w:lvl w:ilvl="4">
+      <w:start w:val="1"/>
+      <w:numFmt w:val="decimal"/>
+      <w:lvlText w:val="%5."/>
+      <w:lvlJc w:val="left"/>
+      <w:pPr>
+        <w:tabs>
+          <w:tab w:val="num" w:pos="0"/>
+        </w:tabs>
+        <w:ind w:left="3600" w:hanging="360"/>
+      </w:pPr>
+      <w:rPr/>
+    </w:lvl>
+    <w:lvl w:ilvl="5">
+      <w:start w:val="1"/>
+      <w:numFmt w:val="decimal"/>
+      <w:lvlText w:val="%6."/>
+      <w:lvlJc w:val="left"/>
+      <w:pPr>
+        <w:tabs>
+          <w:tab w:val="num" w:pos="0"/>
+        </w:tabs>
+        <w:ind w:left="4320" w:hanging="360"/>
+      </w:pPr>
+      <w:rPr/>
+    </w:lvl>
+    <w:lvl w:ilvl="6">
+      <w:start w:val="1"/>
+      <w:numFmt w:val="decimal"/>
+      <w:lvlText w:val="%7."/>
+      <w:lvlJc w:val="left"/>
+      <w:pPr>
+        <w:tabs>
+          <w:tab w:val="num" w:pos="0"/>
+        </w:tabs>
+        <w:ind w:left="5040" w:hanging="360"/>
+      </w:pPr>
+      <w:rPr/>
+    </w:lvl>
+    <w:lvl w:ilvl="7">
+      <w:start w:val="1"/>
+      <w:numFmt w:val="decimal"/>
+      <w:lvlText w:val="%8."/>
+      <w:lvlJc w:val="left"/>
+      <w:pPr>
+        <w:tabs>
+          <w:tab w:val="num" w:pos="0"/>
+        </w:tabs>
+        <w:ind w:left="5760" w:hanging="360"/>
+      </w:pPr>
+      <w:rPr/>
+    </w:lvl>
+    <w:lvl w:ilvl="8">
+      <w:start w:val="1"/>
+      <w:numFmt w:val="decimal"/>
+      <w:lvlText w:val="%9."/>
+      <w:lvlJc w:val="left"/>
+      <w:pPr>
+        <w:tabs>
+          <w:tab w:val="num" w:pos="0"/>
+        </w:tabs>
+        <w:ind w:left="6480" w:hanging="360"/>
+      </w:pPr>
+      <w:rPr/>
+    </w:lvl>
+  </w:abstractNum>
   <w:num w:numId="1">
     <w:abstractNumId w:val="1"/>
   </w:num>
@@ -5262,10 +5393,31 @@
     <w:abstractNumId w:val="6"/>
   </w:num>
   <w:num w:numId="7">
-    <w:abstractNumId w:val="6"/>
+    <w:abstractNumId w:val="7"/>
+  </w:num>
+  <w:num w:numId="8">
+    <w:abstractNumId w:val="7"/>
     <w:lvlOverride w:ilvl="0">
       <w:startOverride w:val="1"/>
     </w:lvlOverride>
+  </w:num>
+  <w:num w:numId="9">
+    <w:abstractNumId w:val="7"/>
+  </w:num>
+  <w:num w:numId="10">
+    <w:abstractNumId w:val="7"/>
+  </w:num>
+  <w:num w:numId="11">
+    <w:abstractNumId w:val="7"/>
+  </w:num>
+  <w:num w:numId="12">
+    <w:abstractNumId w:val="7"/>
+  </w:num>
+  <w:num w:numId="13">
+    <w:abstractNumId w:val="7"/>
+  </w:num>
+  <w:num w:numId="14">
+    <w:abstractNumId w:val="7"/>
   </w:num>
 </w:numbering>
 </file>
@@ -5669,6 +5821,7 @@
     <w:rsid w:val="009a3600"/>
     <w:pPr>
       <w:widowControl/>
+      <w:suppressAutoHyphens w:val="true"/>
       <w:bidi w:val="0"/>
       <w:spacing w:lineRule="auto" w:line="360" w:before="0" w:after="240"/>
       <w:jc w:val="left"/>
@@ -5679,7 +5832,7 @@
       <w:kern w:val="0"/>
       <w:sz w:val="24"/>
       <w:szCs w:val="22"/>
-      <w:lang w:eastAsia="en-US" w:val="pt-PT" w:bidi="ar-SA"/>
+      <w:lang w:val="pt-PT" w:eastAsia="en-US" w:bidi="ar-SA"/>
     </w:rPr>
   </w:style>
   <w:style w:type="paragraph" w:styleId="Heading1">
@@ -6011,6 +6164,7 @@
     <w:rsid w:val="00551df9"/>
     <w:pPr>
       <w:widowControl/>
+      <w:suppressAutoHyphens w:val="true"/>
       <w:bidi w:val="0"/>
       <w:spacing w:before="0" w:after="0"/>
       <w:jc w:val="left"/>
@@ -6021,7 +6175,7 @@
       <w:kern w:val="0"/>
       <w:sz w:val="24"/>
       <w:szCs w:val="22"/>
-      <w:lang w:eastAsia="en-US" w:val="pt-PT" w:bidi="ar-SA"/>
+      <w:lang w:val="pt-PT" w:eastAsia="en-US" w:bidi="ar-SA"/>
     </w:rPr>
   </w:style>
   <w:style w:type="paragraph" w:styleId="HeaderandFooter">

</xml_diff>